<commit_message>
v4: Trim all 4 title variants to under 200 chars (Amazon India hard limit)
</commit_message>
<xml_diff>
--- a/VoltStrike_Amazon_Listing_Optimization.docx
+++ b/VoltStrike_Amazon_Listing_Optimization.docx
@@ -42,7 +42,7 @@
         <w:br/>
         <w:t xml:space="preserve">  - Weekly W19 2026 (03 May – 09 May 2026, reporting date 09-May-2026)</w:t>
         <w:br/>
-        <w:t>Report version: v3 (full three-period trend analysis)</w:t>
+        <w:t>Report version: v4 (titles corrected: all variants now under the 200-character Amazon India limit)</w:t>
         <w:br/>
         <w:t>Prepared on: 22 May 2026</w:t>
       </w:r>
@@ -6769,7 +6769,7 @@
           <w:color w:val="555555"/>
           <w:sz w:val="20"/>
         </w:rPr>
-        <w:t>Amazon India title best practice: Brand → Type → Connection → Mic feature → Driver → Compatibility → Use-case → Colour. Stay ≤ 200 characters. Below titles match the LANGUAGE of the durable winners (Logitech H111 + Amazon Basics USB) with Boat-style USB-A mention to capture residual demand.</w:t>
+        <w:t>Amazon India title best practice: Brand → Type → Connection → Mic feature → Driver → Compatibility → Use-case → Colour. HARD LIMIT: 200 characters including spaces. All variants below have been character-counted.</w:t>
       </w:r>
     </w:p>
     <w:p>
@@ -6809,13 +6809,28 @@
                 <w:color w:val="0B2C55"/>
                 <w:sz w:val="22"/>
               </w:rPr>
-              <w:t>Volt Strike Wired Headphones with Mic, On-Ear USB &amp; 3.5mm Computer Headset, Noise Cancelling Boom Microphone, 40mm Drivers, In-Line Volume &amp; Mute Controls, for PC Laptop Office Calls Teams Zoom (Black)</w:t>
+              <w:t>Volt Strike Wired Headphones with Mic, On-Ear USB &amp; 3.5mm Computer Headset, Noise Cancelling Microphone, 40mm Drivers, In-Line Volume &amp; Mute Controls, for PC Laptop Office Calls Teams Zoom (Black)</w:t>
             </w:r>
           </w:p>
         </w:tc>
       </w:tr>
     </w:tbl>
     <w:p/>
+    <w:p>
+      <w:pPr>
+        <w:spacing w:before="0" w:after="80"/>
+      </w:pPr>
+      <w:r>
+        <w:rPr>
+          <w:rFonts w:ascii="Calibri" w:hAnsi="Calibri"/>
+          <w:b w:val="0"/>
+          <w:i/>
+          <w:color w:val="555555"/>
+          <w:sz w:val="18"/>
+        </w:rPr>
+        <w:t>Length: 196 characters (Amazon India limit: 200).</w:t>
+      </w:r>
+    </w:p>
     <w:p>
       <w:pPr>
         <w:spacing w:before="0" w:after="160"/>
@@ -6828,7 +6843,7 @@
           <w:color w:val="555555"/>
           <w:sz w:val="18"/>
         </w:rPr>
-        <w:t>Keywords covered: wired headphones with mic, headphones with mic, on ear, USB headset, 3.5mm, computer headphone, headset, noise cancelling mic, boom mic, 40mm drivers, volume control, mute, PC, laptop, office calls, Teams, Zoom.</w:t>
+        <w:t>Keywords covered: wired headphones with mic, headphones with mic, on ear, USB headset, 3.5mm, computer headphone, headset, noise cancelling mic, 40mm drivers, volume control, mute, PC, laptop, office calls, Teams, Zoom.</w:t>
       </w:r>
     </w:p>
     <w:p>
@@ -6868,13 +6883,28 @@
                 <w:color w:val="0B2C55"/>
                 <w:sz w:val="22"/>
               </w:rPr>
-              <w:t>Volt Strike USB Wired Headphones with Mic, On-Ear Computer Headset with Noise Cancelling Microphone, 40mm Drivers, In-Line Volume &amp; Mute Control, for PC Laptop Office Calls, Teams Zoom Google Meet (Black)</w:t>
+              <w:t>Volt Strike USB Wired Headphones with Mic, On-Ear Computer Headset, Noise Cancelling Mic, 40mm Drivers, In-Line Volume &amp; Mute Control, for PC Laptop Office Calls, Teams Zoom Google Meet (Black)</w:t>
             </w:r>
           </w:p>
         </w:tc>
       </w:tr>
     </w:tbl>
     <w:p/>
+    <w:p>
+      <w:pPr>
+        <w:spacing w:before="0" w:after="80"/>
+      </w:pPr>
+      <w:r>
+        <w:rPr>
+          <w:rFonts w:ascii="Calibri" w:hAnsi="Calibri"/>
+          <w:b w:val="0"/>
+          <w:i/>
+          <w:color w:val="555555"/>
+          <w:sz w:val="18"/>
+        </w:rPr>
+        <w:t>Length: 193 characters (Amazon India limit: 200).</w:t>
+      </w:r>
+    </w:p>
     <w:p>
       <w:pPr>
         <w:spacing w:before="0" w:after="40"/>
@@ -6912,13 +6942,28 @@
                 <w:color w:val="0B2C55"/>
                 <w:sz w:val="22"/>
               </w:rPr>
-              <w:t>Volt Strike Wired Headphones with Mic, 3.5mm On-Ear Computer Headset with Noise Cancelling Boom Microphone, 40mm Drivers, In-Line Controls, for PC Laptop Mobile Office Calls Teams Zoom (Black)</w:t>
+              <w:t>Volt Strike Wired Headphones with Mic, 3.5mm On-Ear Computer Headset, Noise Cancelling Boom Mic, 40mm Drivers, In-Line Controls, for PC Laptop Mobile Office Calls Teams Zoom (Black)</w:t>
             </w:r>
           </w:p>
         </w:tc>
       </w:tr>
     </w:tbl>
     <w:p/>
+    <w:p>
+      <w:pPr>
+        <w:spacing w:before="0" w:after="80"/>
+      </w:pPr>
+      <w:r>
+        <w:rPr>
+          <w:rFonts w:ascii="Calibri" w:hAnsi="Calibri"/>
+          <w:b w:val="0"/>
+          <w:i/>
+          <w:color w:val="555555"/>
+          <w:sz w:val="18"/>
+        </w:rPr>
+        <w:t>Length: 181 characters (Amazon India limit: 200).</w:t>
+      </w:r>
+    </w:p>
     <w:p>
       <w:pPr>
         <w:spacing w:before="0" w:after="40"/>
@@ -6956,13 +7001,28 @@
                 <w:color w:val="0B2C55"/>
                 <w:sz w:val="22"/>
               </w:rPr>
-              <w:t>Volt Strike Type-C Wired Headphones with Mic, On-Ear Computer Headset with Noise Cancelling Microphone, 40mm Drivers, In-Line Controls, for Laptop, MacBook, Android Phone, Tablet, Office Calls Teams Zoom (Black)</w:t>
+              <w:t>Volt Strike Type-C Wired Headphones with Mic, On-Ear Computer Headset, Noise Cancelling Mic, 40mm Drivers, In-Line Controls, for Laptop, MacBook, Android, Tablet, Office Calls Teams Zoom (Black)</w:t>
             </w:r>
           </w:p>
         </w:tc>
       </w:tr>
     </w:tbl>
     <w:p/>
+    <w:p>
+      <w:pPr>
+        <w:spacing w:before="0" w:after="80"/>
+      </w:pPr>
+      <w:r>
+        <w:rPr>
+          <w:rFonts w:ascii="Calibri" w:hAnsi="Calibri"/>
+          <w:b w:val="0"/>
+          <w:i/>
+          <w:color w:val="555555"/>
+          <w:sz w:val="18"/>
+        </w:rPr>
+        <w:t>Length: 194 characters (Amazon India limit: 200).</w:t>
+      </w:r>
+    </w:p>
     <w:p>
       <w:pPr>
         <w:spacing w:before="40" w:after="80"/>
@@ -9182,7 +9242,7 @@
           <w:color w:val="555555"/>
           <w:sz w:val="18"/>
         </w:rPr>
-        <w:t>— End of report v3 —  |  Built from Brand Analytics Q1 2026 + April 2026 + W19 2026.</w:t>
+        <w:t>— End of report v4 —  |  Built from Brand Analytics Q1 2026 + April 2026 + W19 2026.</w:t>
       </w:r>
     </w:p>
     <w:sectPr>

</xml_diff>